<commit_message>
finished near final draft of application
</commit_message>
<xml_diff>
--- a/Portfolio.docx
+++ b/Portfolio.docx
@@ -142,7 +142,15 @@
           <w:sz w:val="24"/>
           <w:szCs w:val="24"/>
         </w:rPr>
-        <w:t xml:space="preserve">As far as my tech engineering portfolio is concerned, in addition to weblinks </w:t>
+        <w:t>As far as my tech engineering por</w:t>
+      </w:r>
+      <w:r>
+        <w:rPr>
+          <w:rFonts w:ascii="Calibri" w:hAnsi="Calibri" w:cs="Calibri"/>
+          <w:sz w:val="24"/>
+          <w:szCs w:val="24"/>
+        </w:rPr>
+        <w:t xml:space="preserve">tfolio is concerned, in addition to weblinks </w:t>
       </w:r>
       <w:r>
         <w:rPr>
@@ -175,7 +183,47 @@
           <w:sz w:val="24"/>
           <w:szCs w:val="24"/>
         </w:rPr>
-        <w:t xml:space="preserve">source code of some projects in my resume, other notable </w:t>
+        <w:t xml:space="preserve">source code of some projects in my </w:t>
+      </w:r>
+      <w:r>
+        <w:rPr>
+          <w:rFonts w:ascii="Calibri" w:hAnsi="Calibri" w:cs="Calibri"/>
+          <w:sz w:val="24"/>
+          <w:szCs w:val="24"/>
+        </w:rPr>
+        <w:t>c</w:t>
+      </w:r>
+      <w:r>
+        <w:rPr>
+          <w:rFonts w:ascii="Calibri" w:hAnsi="Calibri" w:cs="Calibri"/>
+          <w:sz w:val="24"/>
+          <w:szCs w:val="24"/>
+        </w:rPr>
+        <w:t xml:space="preserve">urriculum </w:t>
+      </w:r>
+      <w:r>
+        <w:rPr>
+          <w:rFonts w:ascii="Calibri" w:hAnsi="Calibri" w:cs="Calibri"/>
+          <w:sz w:val="24"/>
+          <w:szCs w:val="24"/>
+        </w:rPr>
+        <w:t>v</w:t>
+      </w:r>
+      <w:r>
+        <w:rPr>
+          <w:rFonts w:ascii="Calibri" w:hAnsi="Calibri" w:cs="Calibri"/>
+          <w:sz w:val="24"/>
+          <w:szCs w:val="24"/>
+        </w:rPr>
+        <w:t>itae</w:t>
+      </w:r>
+      <w:r>
+        <w:rPr>
+          <w:rFonts w:ascii="Calibri" w:hAnsi="Calibri" w:cs="Calibri"/>
+          <w:sz w:val="24"/>
+          <w:szCs w:val="24"/>
+        </w:rPr>
+        <w:t xml:space="preserve">, other notable </w:t>
       </w:r>
       <w:r>
         <w:rPr>
@@ -202,6 +250,8 @@
           <w:szCs w:val="24"/>
         </w:rPr>
       </w:pPr>
+      <w:bookmarkStart w:id="0" w:name="_GoBack"/>
+      <w:bookmarkEnd w:id="0"/>
     </w:p>
     <w:p>
       <w:pPr>
@@ -333,6 +383,7 @@
         <w:t xml:space="preserve">packages at </w:t>
       </w:r>
       <w:hyperlink r:id="rId7" w:history="1">
+        <w:proofErr w:type="spellStart"/>
         <w:r>
           <w:rPr>
             <w:rStyle w:val="Hyperlink"/>
@@ -342,6 +393,7 @@
           </w:rPr>
           <w:t>npm</w:t>
         </w:r>
+        <w:proofErr w:type="spellEnd"/>
       </w:hyperlink>
       <w:r>
         <w:rPr>
@@ -352,6 +404,7 @@
         <w:t xml:space="preserve">, among which predominantly </w:t>
       </w:r>
       <w:hyperlink r:id="rId8" w:history="1">
+        <w:proofErr w:type="spellStart"/>
         <w:r>
           <w:rPr>
             <w:rStyle w:val="Hyperlink"/>
@@ -359,8 +412,29 @@
             <w:sz w:val="24"/>
             <w:szCs w:val="24"/>
           </w:rPr>
-          <w:t>videojs-landscape-fullscreen</w:t>
+          <w:t>videojs</w:t>
         </w:r>
+        <w:proofErr w:type="spellEnd"/>
+        <w:r>
+          <w:rPr>
+            <w:rStyle w:val="Hyperlink"/>
+            <w:rFonts w:eastAsia="MS Mincho"/>
+            <w:sz w:val="24"/>
+            <w:szCs w:val="24"/>
+          </w:rPr>
+          <w:t>-landscape-</w:t>
+        </w:r>
+        <w:proofErr w:type="spellStart"/>
+        <w:r>
+          <w:rPr>
+            <w:rStyle w:val="Hyperlink"/>
+            <w:rFonts w:eastAsia="MS Mincho"/>
+            <w:sz w:val="24"/>
+            <w:szCs w:val="24"/>
+          </w:rPr>
+          <w:t>fullscreen</w:t>
+        </w:r>
+        <w:proofErr w:type="spellEnd"/>
       </w:hyperlink>
       <w:r>
         <w:rPr>
@@ -459,8 +533,6 @@
         </w:rPr>
         <w:t>executable</w:t>
       </w:r>
-      <w:bookmarkStart w:id="0" w:name="_GoBack"/>
-      <w:bookmarkEnd w:id="0"/>
       <w:r>
         <w:rPr>
           <w:rFonts w:eastAsia="MS Mincho"/>
@@ -470,6 +542,7 @@
         <w:t xml:space="preserve"> from its </w:t>
       </w:r>
       <w:hyperlink r:id="rId10" w:history="1">
+        <w:proofErr w:type="spellStart"/>
         <w:r>
           <w:rPr>
             <w:rStyle w:val="Hyperlink"/>
@@ -477,7 +550,17 @@
             <w:sz w:val="24"/>
             <w:szCs w:val="24"/>
           </w:rPr>
-          <w:t>SourceForge repository</w:t>
+          <w:t>SourceForge</w:t>
+        </w:r>
+        <w:proofErr w:type="spellEnd"/>
+        <w:r>
+          <w:rPr>
+            <w:rStyle w:val="Hyperlink"/>
+            <w:rFonts w:eastAsia="MS Mincho"/>
+            <w:sz w:val="24"/>
+            <w:szCs w:val="24"/>
+          </w:rPr>
+          <w:t xml:space="preserve"> repository</w:t>
         </w:r>
       </w:hyperlink>
       <w:r>

</xml_diff>